<commit_message>
Update  Phase 1 document formatting
</commit_message>
<xml_diff>
--- a/Phase 1 - Brainstorming & Ideation/Phase 1 - Brainstorming & Ideation.docx
+++ b/Phase 1 - Brainstorming & Ideation/Phase 1 - Brainstorming & Ideation.docx
@@ -6,115 +6,183 @@
       <w:pPr>
         <w:jc w:val="center"/>
         <w:rPr>
+          <w:rFonts w:ascii="Times New Roman" w:hAnsi="Times New Roman" w:cs="Times New Roman"/>
           <w:b/>
           <w:bCs/>
-        </w:rPr>
-      </w:pPr>
-      <w:r>
-        <w:rPr>
+          <w:sz w:val="32"/>
+          <w:szCs w:val="32"/>
+        </w:rPr>
+      </w:pPr>
+      <w:r>
+        <w:rPr>
+          <w:rFonts w:ascii="Times New Roman" w:hAnsi="Times New Roman" w:cs="Times New Roman"/>
           <w:b/>
           <w:bCs/>
+          <w:sz w:val="32"/>
+          <w:szCs w:val="32"/>
         </w:rPr>
         <w:t>Phase 1 – Brainstorming &amp; Ideation</w:t>
       </w:r>
     </w:p>
     <w:p>
       <w:pPr>
-        <w:rPr>
+        <w:jc w:val="center"/>
+        <w:rPr>
+          <w:rFonts w:ascii="Times New Roman" w:hAnsi="Times New Roman" w:cs="Times New Roman"/>
+          <w:sz w:val="32"/>
+          <w:szCs w:val="32"/>
+        </w:rPr>
+      </w:pPr>
+      <w:r>
+        <w:rPr>
+          <w:rFonts w:ascii="Times New Roman" w:hAnsi="Times New Roman" w:cs="Times New Roman"/>
           <w:b/>
           <w:bCs/>
-        </w:rPr>
-      </w:pPr>
-    </w:p>
-    <w:p>
-      <w:pPr>
-        <w:jc w:val="center"/>
-      </w:pPr>
-      <w:r>
-        <w:rPr>
+          <w:sz w:val="32"/>
+          <w:szCs w:val="32"/>
+        </w:rPr>
+        <w:t>Script-Controlled ACL – Restrict Record Access Based on Field Value</w:t>
+      </w:r>
+    </w:p>
+    <w:p>
+      <w:pPr>
+        <w:rPr>
+          <w:rFonts w:ascii="Times New Roman" w:hAnsi="Times New Roman" w:cs="Times New Roman"/>
           <w:b/>
           <w:bCs/>
-        </w:rPr>
-        <w:t>Script-Controlled ACL – Restrict Record Access Based on Field Value</w:t>
-      </w:r>
-    </w:p>
-    <w:p>
-      <w:pPr>
-        <w:rPr>
+          <w:sz w:val="28"/>
+          <w:szCs w:val="28"/>
+        </w:rPr>
+      </w:pPr>
+      <w:r>
+        <w:rPr>
+          <w:rFonts w:ascii="Times New Roman" w:hAnsi="Times New Roman" w:cs="Times New Roman"/>
           <w:b/>
           <w:bCs/>
-        </w:rPr>
-      </w:pPr>
-      <w:r>
-        <w:rPr>
+          <w:sz w:val="28"/>
+          <w:szCs w:val="28"/>
+        </w:rPr>
+        <w:t>1. Project Idea</w:t>
+      </w:r>
+    </w:p>
+    <w:p>
+      <w:pPr>
+        <w:rPr>
+          <w:rFonts w:ascii="Times New Roman" w:hAnsi="Times New Roman" w:cs="Times New Roman"/>
+        </w:rPr>
+      </w:pPr>
+      <w:r>
+        <w:rPr>
+          <w:rFonts w:ascii="Times New Roman" w:hAnsi="Times New Roman" w:cs="Times New Roman"/>
+        </w:rPr>
+        <w:t>This project demonstrates how a script-controlled Access Control List (ACL) can be used to restrict users from accessing records based on specific conditions.</w:t>
+      </w:r>
+    </w:p>
+    <w:p>
+      <w:pPr>
+        <w:rPr>
+          <w:rFonts w:ascii="Times New Roman" w:hAnsi="Times New Roman" w:cs="Times New Roman"/>
+        </w:rPr>
+      </w:pPr>
+      <w:r>
+        <w:rPr>
+          <w:rFonts w:ascii="Times New Roman" w:hAnsi="Times New Roman" w:cs="Times New Roman"/>
+        </w:rPr>
+        <w:t>In this project, access to institution records is controlled using user roles and the value of the Branch field.</w:t>
+      </w:r>
+    </w:p>
+    <w:p>
+      <w:pPr>
+        <w:rPr>
+          <w:rFonts w:ascii="Times New Roman" w:hAnsi="Times New Roman" w:cs="Times New Roman"/>
           <w:b/>
           <w:bCs/>
-        </w:rPr>
-        <w:t>1. Project Idea</w:t>
-      </w:r>
-    </w:p>
-    <w:p>
-      <w:r>
-        <w:t>This project demonstrates how a script-controlled Access Control List (ACL) can be used to restrict users from accessing records based on specific conditions.</w:t>
-      </w:r>
-    </w:p>
-    <w:p>
-      <w:r>
-        <w:t>In this project, access to institution records is controlled using user roles and the value of the Branch field.</w:t>
-      </w:r>
-    </w:p>
-    <w:p>
-      <w:pPr>
-        <w:rPr>
+          <w:sz w:val="28"/>
+          <w:szCs w:val="28"/>
+        </w:rPr>
+      </w:pPr>
+      <w:r>
+        <w:rPr>
+          <w:rFonts w:ascii="Times New Roman" w:hAnsi="Times New Roman" w:cs="Times New Roman"/>
           <w:b/>
           <w:bCs/>
-        </w:rPr>
-      </w:pPr>
-      <w:r>
-        <w:rPr>
+          <w:sz w:val="28"/>
+          <w:szCs w:val="28"/>
+        </w:rPr>
+        <w:t>2. Problem Identification</w:t>
+      </w:r>
+    </w:p>
+    <w:p>
+      <w:pPr>
+        <w:rPr>
+          <w:rFonts w:ascii="Times New Roman" w:hAnsi="Times New Roman" w:cs="Times New Roman"/>
+        </w:rPr>
+      </w:pPr>
+      <w:r>
+        <w:rPr>
+          <w:rFonts w:ascii="Times New Roman" w:hAnsi="Times New Roman" w:cs="Times New Roman"/>
+        </w:rPr>
+        <w:t>In a ServiceNow application, all users should not necessarily have access to every record. Some records may contain information that should be accessible only to authorized users.</w:t>
+      </w:r>
+    </w:p>
+    <w:p>
+      <w:pPr>
+        <w:rPr>
+          <w:rFonts w:ascii="Times New Roman" w:hAnsi="Times New Roman" w:cs="Times New Roman"/>
+        </w:rPr>
+      </w:pPr>
+      <w:r>
+        <w:rPr>
+          <w:rFonts w:ascii="Times New Roman" w:hAnsi="Times New Roman" w:cs="Times New Roman"/>
+        </w:rPr>
+        <w:t>The project focuses on restricting access to records according to the user's role and the branch value of the record.</w:t>
+      </w:r>
+    </w:p>
+    <w:p>
+      <w:pPr>
+        <w:rPr>
+          <w:rFonts w:ascii="Times New Roman" w:hAnsi="Times New Roman" w:cs="Times New Roman"/>
           <w:b/>
           <w:bCs/>
-        </w:rPr>
-        <w:t>2. Problem Identification</w:t>
-      </w:r>
-    </w:p>
-    <w:p>
-      <w:r>
-        <w:t>In a ServiceNow application, all users should not necessarily have access to every record. Some records may contain information that should be accessible only to authorized users.</w:t>
-      </w:r>
-    </w:p>
-    <w:p>
-      <w:r>
-        <w:t>The project focuses on restricting access to records according to the user's role and the branch value of the record.</w:t>
-      </w:r>
-    </w:p>
-    <w:p>
-      <w:pPr>
-        <w:rPr>
+          <w:sz w:val="28"/>
+          <w:szCs w:val="28"/>
+        </w:rPr>
+      </w:pPr>
+      <w:r>
+        <w:rPr>
+          <w:rFonts w:ascii="Times New Roman" w:hAnsi="Times New Roman" w:cs="Times New Roman"/>
           <w:b/>
           <w:bCs/>
-        </w:rPr>
-      </w:pPr>
-      <w:r>
-        <w:rPr>
+          <w:sz w:val="28"/>
+          <w:szCs w:val="28"/>
+        </w:rPr>
+        <w:t>3. Proposed Solution</w:t>
+      </w:r>
+    </w:p>
+    <w:p>
+      <w:pPr>
+        <w:rPr>
+          <w:rFonts w:ascii="Times New Roman" w:hAnsi="Times New Roman" w:cs="Times New Roman"/>
+        </w:rPr>
+      </w:pPr>
+      <w:r>
+        <w:rPr>
+          <w:rFonts w:ascii="Times New Roman" w:hAnsi="Times New Roman" w:cs="Times New Roman"/>
+        </w:rPr>
+        <w:t xml:space="preserve">A custom </w:t>
+      </w:r>
+      <w:r>
+        <w:rPr>
+          <w:rFonts w:ascii="Times New Roman" w:hAnsi="Times New Roman" w:cs="Times New Roman"/>
           <w:b/>
           <w:bCs/>
         </w:rPr>
-        <w:t>3. Proposed Solution</w:t>
-      </w:r>
-    </w:p>
-    <w:p>
-      <w:r>
-        <w:t xml:space="preserve">A custom </w:t>
-      </w:r>
-      <w:r>
-        <w:rPr>
-          <w:b/>
-          <w:bCs/>
-        </w:rPr>
         <w:t>Institution Details</w:t>
       </w:r>
       <w:r>
+        <w:rPr>
+          <w:rFonts w:ascii="Times New Roman" w:hAnsi="Times New Roman" w:cs="Times New Roman"/>
+        </w:rPr>
         <w:t xml:space="preserve"> table is created in ServiceNow. Different records are created with branch values such as:</w:t>
       </w:r>
     </w:p>
@@ -124,8 +192,14 @@
           <w:ilvl w:val="0"/>
           <w:numId w:val="1"/>
         </w:numPr>
-      </w:pPr>
-      <w:r>
+        <w:rPr>
+          <w:rFonts w:ascii="Times New Roman" w:hAnsi="Times New Roman" w:cs="Times New Roman"/>
+        </w:rPr>
+      </w:pPr>
+      <w:r>
+        <w:rPr>
+          <w:rFonts w:ascii="Times New Roman" w:hAnsi="Times New Roman" w:cs="Times New Roman"/>
+        </w:rPr>
         <w:t>ECE</w:t>
       </w:r>
     </w:p>
@@ -135,8 +209,14 @@
           <w:ilvl w:val="0"/>
           <w:numId w:val="1"/>
         </w:numPr>
-      </w:pPr>
-      <w:r>
+        <w:rPr>
+          <w:rFonts w:ascii="Times New Roman" w:hAnsi="Times New Roman" w:cs="Times New Roman"/>
+        </w:rPr>
+      </w:pPr>
+      <w:r>
+        <w:rPr>
+          <w:rFonts w:ascii="Times New Roman" w:hAnsi="Times New Roman" w:cs="Times New Roman"/>
+        </w:rPr>
         <w:t>EEE</w:t>
       </w:r>
     </w:p>
@@ -146,33 +226,61 @@
           <w:ilvl w:val="0"/>
           <w:numId w:val="1"/>
         </w:numPr>
-      </w:pPr>
-      <w:r>
+        <w:rPr>
+          <w:rFonts w:ascii="Times New Roman" w:hAnsi="Times New Roman" w:cs="Times New Roman"/>
+        </w:rPr>
+      </w:pPr>
+      <w:r>
+        <w:rPr>
+          <w:rFonts w:ascii="Times New Roman" w:hAnsi="Times New Roman" w:cs="Times New Roman"/>
+        </w:rPr>
         <w:t>CSE</w:t>
       </w:r>
     </w:p>
     <w:p>
-      <w:r>
+      <w:pPr>
+        <w:rPr>
+          <w:rFonts w:ascii="Times New Roman" w:hAnsi="Times New Roman" w:cs="Times New Roman"/>
+        </w:rPr>
+      </w:pPr>
+      <w:r>
+        <w:rPr>
+          <w:rFonts w:ascii="Times New Roman" w:hAnsi="Times New Roman" w:cs="Times New Roman"/>
+        </w:rPr>
         <w:t>ACLs are then used to control different operations on these records.</w:t>
       </w:r>
     </w:p>
     <w:p>
       <w:pPr>
         <w:rPr>
+          <w:rFonts w:ascii="Times New Roman" w:hAnsi="Times New Roman" w:cs="Times New Roman"/>
           <w:b/>
           <w:bCs/>
-        </w:rPr>
-      </w:pPr>
-      <w:r>
-        <w:rPr>
+          <w:sz w:val="28"/>
+          <w:szCs w:val="28"/>
+        </w:rPr>
+      </w:pPr>
+      <w:r>
+        <w:rPr>
+          <w:rFonts w:ascii="Times New Roman" w:hAnsi="Times New Roman" w:cs="Times New Roman"/>
           <w:b/>
           <w:bCs/>
+          <w:sz w:val="28"/>
+          <w:szCs w:val="28"/>
         </w:rPr>
         <w:t>4. Access Control Idea</w:t>
       </w:r>
     </w:p>
     <w:p>
-      <w:r>
+      <w:pPr>
+        <w:rPr>
+          <w:rFonts w:ascii="Times New Roman" w:hAnsi="Times New Roman" w:cs="Times New Roman"/>
+        </w:rPr>
+      </w:pPr>
+      <w:r>
+        <w:rPr>
+          <w:rFonts w:ascii="Times New Roman" w:hAnsi="Times New Roman" w:cs="Times New Roman"/>
+        </w:rPr>
         <w:t>The project uses four types of record-level ACL operations:</w:t>
       </w:r>
     </w:p>
@@ -182,8 +290,14 @@
           <w:ilvl w:val="0"/>
           <w:numId w:val="2"/>
         </w:numPr>
-      </w:pPr>
-      <w:r>
+        <w:rPr>
+          <w:rFonts w:ascii="Times New Roman" w:hAnsi="Times New Roman" w:cs="Times New Roman"/>
+        </w:rPr>
+      </w:pPr>
+      <w:r>
+        <w:rPr>
+          <w:rFonts w:ascii="Times New Roman" w:hAnsi="Times New Roman" w:cs="Times New Roman"/>
+        </w:rPr>
         <w:t>READ</w:t>
       </w:r>
     </w:p>
@@ -193,8 +307,14 @@
           <w:ilvl w:val="0"/>
           <w:numId w:val="2"/>
         </w:numPr>
-      </w:pPr>
-      <w:r>
+        <w:rPr>
+          <w:rFonts w:ascii="Times New Roman" w:hAnsi="Times New Roman" w:cs="Times New Roman"/>
+        </w:rPr>
+      </w:pPr>
+      <w:r>
+        <w:rPr>
+          <w:rFonts w:ascii="Times New Roman" w:hAnsi="Times New Roman" w:cs="Times New Roman"/>
+        </w:rPr>
         <w:t>CREATE</w:t>
       </w:r>
     </w:p>
@@ -204,8 +324,14 @@
           <w:ilvl w:val="0"/>
           <w:numId w:val="2"/>
         </w:numPr>
-      </w:pPr>
-      <w:r>
+        <w:rPr>
+          <w:rFonts w:ascii="Times New Roman" w:hAnsi="Times New Roman" w:cs="Times New Roman"/>
+        </w:rPr>
+      </w:pPr>
+      <w:r>
+        <w:rPr>
+          <w:rFonts w:ascii="Times New Roman" w:hAnsi="Times New Roman" w:cs="Times New Roman"/>
+        </w:rPr>
         <w:t>WRITE</w:t>
       </w:r>
     </w:p>
@@ -215,13 +341,27 @@
           <w:ilvl w:val="0"/>
           <w:numId w:val="2"/>
         </w:numPr>
-      </w:pPr>
-      <w:r>
+        <w:rPr>
+          <w:rFonts w:ascii="Times New Roman" w:hAnsi="Times New Roman" w:cs="Times New Roman"/>
+        </w:rPr>
+      </w:pPr>
+      <w:r>
+        <w:rPr>
+          <w:rFonts w:ascii="Times New Roman" w:hAnsi="Times New Roman" w:cs="Times New Roman"/>
+        </w:rPr>
         <w:t>DELETE</w:t>
       </w:r>
     </w:p>
     <w:p>
-      <w:r>
+      <w:pPr>
+        <w:rPr>
+          <w:rFonts w:ascii="Times New Roman" w:hAnsi="Times New Roman" w:cs="Times New Roman"/>
+        </w:rPr>
+      </w:pPr>
+      <w:r>
+        <w:rPr>
+          <w:rFonts w:ascii="Times New Roman" w:hAnsi="Times New Roman" w:cs="Times New Roman"/>
+        </w:rPr>
         <w:t>Different custom roles are assigned for these operations:</w:t>
       </w:r>
     </w:p>
@@ -231,8 +371,14 @@
           <w:ilvl w:val="0"/>
           <w:numId w:val="3"/>
         </w:numPr>
-      </w:pPr>
-      <w:r>
+        <w:rPr>
+          <w:rFonts w:ascii="Times New Roman" w:hAnsi="Times New Roman" w:cs="Times New Roman"/>
+        </w:rPr>
+      </w:pPr>
+      <w:r>
+        <w:rPr>
+          <w:rFonts w:ascii="Times New Roman" w:hAnsi="Times New Roman" w:cs="Times New Roman"/>
+        </w:rPr>
         <w:t>bb1 – Read access</w:t>
       </w:r>
     </w:p>
@@ -242,8 +388,14 @@
           <w:ilvl w:val="0"/>
           <w:numId w:val="3"/>
         </w:numPr>
-      </w:pPr>
-      <w:r>
+        <w:rPr>
+          <w:rFonts w:ascii="Times New Roman" w:hAnsi="Times New Roman" w:cs="Times New Roman"/>
+        </w:rPr>
+      </w:pPr>
+      <w:r>
+        <w:rPr>
+          <w:rFonts w:ascii="Times New Roman" w:hAnsi="Times New Roman" w:cs="Times New Roman"/>
+        </w:rPr>
         <w:t>bb2 – Create access</w:t>
       </w:r>
     </w:p>
@@ -253,9 +405,14 @@
           <w:ilvl w:val="0"/>
           <w:numId w:val="3"/>
         </w:numPr>
-      </w:pPr>
-      <w:r>
-        <w:lastRenderedPageBreak/>
+        <w:rPr>
+          <w:rFonts w:ascii="Times New Roman" w:hAnsi="Times New Roman" w:cs="Times New Roman"/>
+        </w:rPr>
+      </w:pPr>
+      <w:r>
+        <w:rPr>
+          <w:rFonts w:ascii="Times New Roman" w:hAnsi="Times New Roman" w:cs="Times New Roman"/>
+        </w:rPr>
         <w:t>bb3 – Write access</w:t>
       </w:r>
     </w:p>
@@ -265,38 +422,79 @@
           <w:ilvl w:val="0"/>
           <w:numId w:val="3"/>
         </w:numPr>
-      </w:pPr>
-      <w:r>
+        <w:rPr>
+          <w:rFonts w:ascii="Times New Roman" w:hAnsi="Times New Roman" w:cs="Times New Roman"/>
+        </w:rPr>
+      </w:pPr>
+      <w:r>
+        <w:rPr>
+          <w:rFonts w:ascii="Times New Roman" w:hAnsi="Times New Roman" w:cs="Times New Roman"/>
+        </w:rPr>
+        <w:lastRenderedPageBreak/>
         <w:t>bb4 – Delete access</w:t>
       </w:r>
     </w:p>
     <w:p>
       <w:pPr>
         <w:rPr>
+          <w:rFonts w:ascii="Times New Roman" w:hAnsi="Times New Roman" w:cs="Times New Roman"/>
           <w:b/>
           <w:bCs/>
-        </w:rPr>
-      </w:pPr>
-      <w:r>
-        <w:rPr>
+          <w:sz w:val="28"/>
+          <w:szCs w:val="28"/>
+        </w:rPr>
+      </w:pPr>
+      <w:r>
+        <w:rPr>
+          <w:rFonts w:ascii="Times New Roman" w:hAnsi="Times New Roman" w:cs="Times New Roman"/>
           <w:b/>
           <w:bCs/>
+          <w:sz w:val="28"/>
+          <w:szCs w:val="28"/>
         </w:rPr>
         <w:t>5. Expected Outcome</w:t>
       </w:r>
     </w:p>
     <w:p>
-      <w:r>
+      <w:pPr>
+        <w:rPr>
+          <w:rFonts w:ascii="Times New Roman" w:hAnsi="Times New Roman" w:cs="Times New Roman"/>
+        </w:rPr>
+      </w:pPr>
+      <w:r>
+        <w:rPr>
+          <w:rFonts w:ascii="Times New Roman" w:hAnsi="Times New Roman" w:cs="Times New Roman"/>
+        </w:rPr>
         <w:t>The expected result is that unauthorized users cannot access protected records, while users with the required roles can perform the operations allowed by the ACL configuration.</w:t>
       </w:r>
     </w:p>
     <w:p>
-      <w:r>
+      <w:pPr>
+        <w:rPr>
+          <w:rFonts w:ascii="Times New Roman" w:hAnsi="Times New Roman" w:cs="Times New Roman"/>
+        </w:rPr>
+      </w:pPr>
+      <w:r>
+        <w:rPr>
+          <w:rFonts w:ascii="Times New Roman" w:hAnsi="Times New Roman" w:cs="Times New Roman"/>
+        </w:rPr>
         <w:t>Administrators retain full access to the records.</w:t>
       </w:r>
     </w:p>
-    <w:p/>
+    <w:p>
+      <w:pPr>
+        <w:rPr>
+          <w:rFonts w:ascii="Times New Roman" w:hAnsi="Times New Roman" w:cs="Times New Roman"/>
+        </w:rPr>
+      </w:pPr>
+    </w:p>
     <w:sectPr>
+      <w:headerReference w:type="even" r:id="rId8"/>
+      <w:headerReference w:type="default" r:id="rId9"/>
+      <w:footerReference w:type="even" r:id="rId10"/>
+      <w:footerReference w:type="default" r:id="rId11"/>
+      <w:headerReference w:type="first" r:id="rId12"/>
+      <w:footerReference w:type="first" r:id="rId13"/>
       <w:pgSz w:w="11906" w:h="16838"/>
       <w:pgMar w:top="1440" w:right="1440" w:bottom="1440" w:left="1440" w:header="708" w:footer="708" w:gutter="0"/>
       <w:cols w:space="708"/>
@@ -304,6 +502,116 @@
     </w:sectPr>
   </w:body>
 </w:document>
+</file>
+
+<file path=word/endnotes.xml><?xml version="1.0" encoding="utf-8"?>
+<w:endnotes xmlns:wpc="http://schemas.microsoft.com/office/word/2010/wordprocessingCanvas" xmlns:cx="http://schemas.microsoft.com/office/drawing/2014/chartex" xmlns:cx1="http://schemas.microsoft.com/office/drawing/2015/9/8/chartex" xmlns:cx2="http://schemas.microsoft.com/office/drawing/2015/10/21/chartex" xmlns:cx3="http://schemas.microsoft.com/office/drawing/2016/5/9/chartex" xmlns:cx4="http://schemas.microsoft.com/office/drawing/2016/5/10/chartex" xmlns:cx5="http://schemas.microsoft.com/office/drawing/2016/5/11/chartex" xmlns:cx6="http://schemas.microsoft.com/office/drawing/2016/5/12/chartex" xmlns:cx7="http://schemas.microsoft.com/office/drawing/2016/5/13/chartex" xmlns:cx8="http://schemas.microsoft.com/office/drawing/2016/5/14/chartex" xmlns:mc="http://schemas.openxmlformats.org/markup-compatibility/2006" xmlns:aink="http://schemas.microsoft.com/office/drawing/2016/ink" xmlns:am3d="http://schemas.microsoft.com/office/drawing/2017/model3d" xmlns:o="urn:schemas-microsoft-com:office:office" xmlns:oel="http://schemas.microsoft.com/office/2019/extlst" xmlns:r="http://schemas.openxmlformats.org/officeDocument/2006/relationships" xmlns:m="http://schemas.openxmlformats.org/officeDocument/2006/math" xmlns:v="urn:schemas-microsoft-com:vml" xmlns:wp14="http://schemas.microsoft.com/office/word/2010/wordprocessingDrawing" xmlns:wp="http://schemas.openxmlformats.org/drawingml/2006/wordprocessingDrawing" xmlns:w10="urn:schemas-microsoft-com:office:word" xmlns:w="http://schemas.openxmlformats.org/wordprocessingml/2006/main" xmlns:w14="http://schemas.microsoft.com/office/word/2010/wordml" xmlns:w15="http://schemas.microsoft.com/office/word/2012/wordml" xmlns:w16cex="http://schemas.microsoft.com/office/word/2018/wordml/cex" xmlns:w16cid="http://schemas.microsoft.com/office/word/2016/wordml/cid" xmlns:w16="http://schemas.microsoft.com/office/word/2018/wordml" xmlns:w16du="http://schemas.microsoft.com/office/word/2023/wordml/word16du" xmlns:w16sdtdh="http://schemas.microsoft.com/office/word/2020/wordml/sdtdatahash" xmlns:w16sdtfl="http://schemas.microsoft.com/office/word/2024/wordml/sdtformatlock" xmlns:w16se="http://schemas.microsoft.com/office/word/2015/wordml/symex" xmlns:wpg="http://schemas.microsoft.com/office/word/2010/wordprocessingGroup" xmlns:wpi="http://schemas.microsoft.com/office/word/2010/wordprocessingInk" xmlns:wne="http://schemas.microsoft.com/office/word/2006/wordml" xmlns:wps="http://schemas.microsoft.com/office/word/2010/wordprocessingShape" mc:Ignorable="w14 w15 w16se w16cid w16 w16cex w16sdtdh w16sdtfl w16du wp14">
+  <w:endnote w:type="separator" w:id="-1">
+    <w:p>
+      <w:pPr>
+        <w:spacing w:after="0" w:line="240" w:lineRule="auto"/>
+      </w:pPr>
+      <w:r>
+        <w:separator/>
+      </w:r>
+    </w:p>
+  </w:endnote>
+  <w:endnote w:type="continuationSeparator" w:id="0">
+    <w:p>
+      <w:pPr>
+        <w:spacing w:after="0" w:line="240" w:lineRule="auto"/>
+      </w:pPr>
+      <w:r>
+        <w:continuationSeparator/>
+      </w:r>
+    </w:p>
+  </w:endnote>
+</w:endnotes>
+</file>
+
+<file path=word/footer1.xml><?xml version="1.0" encoding="utf-8"?>
+<w:ftr xmlns:wpc="http://schemas.microsoft.com/office/word/2010/wordprocessingCanvas" xmlns:cx="http://schemas.microsoft.com/office/drawing/2014/chartex" xmlns:cx1="http://schemas.microsoft.com/office/drawing/2015/9/8/chartex" xmlns:cx2="http://schemas.microsoft.com/office/drawing/2015/10/21/chartex" xmlns:cx3="http://schemas.microsoft.com/office/drawing/2016/5/9/chartex" xmlns:cx4="http://schemas.microsoft.com/office/drawing/2016/5/10/chartex" xmlns:cx5="http://schemas.microsoft.com/office/drawing/2016/5/11/chartex" xmlns:cx6="http://schemas.microsoft.com/office/drawing/2016/5/12/chartex" xmlns:cx7="http://schemas.microsoft.com/office/drawing/2016/5/13/chartex" xmlns:cx8="http://schemas.microsoft.com/office/drawing/2016/5/14/chartex" xmlns:mc="http://schemas.openxmlformats.org/markup-compatibility/2006" xmlns:aink="http://schemas.microsoft.com/office/drawing/2016/ink" xmlns:am3d="http://schemas.microsoft.com/office/drawing/2017/model3d" xmlns:o="urn:schemas-microsoft-com:office:office" xmlns:oel="http://schemas.microsoft.com/office/2019/extlst" xmlns:r="http://schemas.openxmlformats.org/officeDocument/2006/relationships" xmlns:m="http://schemas.openxmlformats.org/officeDocument/2006/math" xmlns:v="urn:schemas-microsoft-com:vml" xmlns:wp14="http://schemas.microsoft.com/office/word/2010/wordprocessingDrawing" xmlns:wp="http://schemas.openxmlformats.org/drawingml/2006/wordprocessingDrawing" xmlns:w10="urn:schemas-microsoft-com:office:word" xmlns:w="http://schemas.openxmlformats.org/wordprocessingml/2006/main" xmlns:w14="http://schemas.microsoft.com/office/word/2010/wordml" xmlns:w15="http://schemas.microsoft.com/office/word/2012/wordml" xmlns:w16cex="http://schemas.microsoft.com/office/word/2018/wordml/cex" xmlns:w16cid="http://schemas.microsoft.com/office/word/2016/wordml/cid" xmlns:w16="http://schemas.microsoft.com/office/word/2018/wordml" xmlns:w16du="http://schemas.microsoft.com/office/word/2023/wordml/word16du" xmlns:w16sdtdh="http://schemas.microsoft.com/office/word/2020/wordml/sdtdatahash" xmlns:w16sdtfl="http://schemas.microsoft.com/office/word/2024/wordml/sdtformatlock" xmlns:w16se="http://schemas.microsoft.com/office/word/2015/wordml/symex" xmlns:wpg="http://schemas.microsoft.com/office/word/2010/wordprocessingGroup" xmlns:wpi="http://schemas.microsoft.com/office/word/2010/wordprocessingInk" xmlns:wne="http://schemas.microsoft.com/office/word/2006/wordml" xmlns:wps="http://schemas.microsoft.com/office/word/2010/wordprocessingShape" mc:Ignorable="w14 w15 w16se w16cid w16 w16cex w16sdtdh w16sdtfl w16du wp14">
+  <w:p>
+    <w:pPr>
+      <w:pStyle w:val="Footer"/>
+    </w:pPr>
+  </w:p>
+</w:ftr>
+</file>
+
+<file path=word/footer2.xml><?xml version="1.0" encoding="utf-8"?>
+<w:ftr xmlns:wpc="http://schemas.microsoft.com/office/word/2010/wordprocessingCanvas" xmlns:cx="http://schemas.microsoft.com/office/drawing/2014/chartex" xmlns:cx1="http://schemas.microsoft.com/office/drawing/2015/9/8/chartex" xmlns:cx2="http://schemas.microsoft.com/office/drawing/2015/10/21/chartex" xmlns:cx3="http://schemas.microsoft.com/office/drawing/2016/5/9/chartex" xmlns:cx4="http://schemas.microsoft.com/office/drawing/2016/5/10/chartex" xmlns:cx5="http://schemas.microsoft.com/office/drawing/2016/5/11/chartex" xmlns:cx6="http://schemas.microsoft.com/office/drawing/2016/5/12/chartex" xmlns:cx7="http://schemas.microsoft.com/office/drawing/2016/5/13/chartex" xmlns:cx8="http://schemas.microsoft.com/office/drawing/2016/5/14/chartex" xmlns:mc="http://schemas.openxmlformats.org/markup-compatibility/2006" xmlns:aink="http://schemas.microsoft.com/office/drawing/2016/ink" xmlns:am3d="http://schemas.microsoft.com/office/drawing/2017/model3d" xmlns:o="urn:schemas-microsoft-com:office:office" xmlns:oel="http://schemas.microsoft.com/office/2019/extlst" xmlns:r="http://schemas.openxmlformats.org/officeDocument/2006/relationships" xmlns:m="http://schemas.openxmlformats.org/officeDocument/2006/math" xmlns:v="urn:schemas-microsoft-com:vml" xmlns:wp14="http://schemas.microsoft.com/office/word/2010/wordprocessingDrawing" xmlns:wp="http://schemas.openxmlformats.org/drawingml/2006/wordprocessingDrawing" xmlns:w10="urn:schemas-microsoft-com:office:word" xmlns:w="http://schemas.openxmlformats.org/wordprocessingml/2006/main" xmlns:w14="http://schemas.microsoft.com/office/word/2010/wordml" xmlns:w15="http://schemas.microsoft.com/office/word/2012/wordml" xmlns:w16cex="http://schemas.microsoft.com/office/word/2018/wordml/cex" xmlns:w16cid="http://schemas.microsoft.com/office/word/2016/wordml/cid" xmlns:w16="http://schemas.microsoft.com/office/word/2018/wordml" xmlns:w16du="http://schemas.microsoft.com/office/word/2023/wordml/word16du" xmlns:w16sdtdh="http://schemas.microsoft.com/office/word/2020/wordml/sdtdatahash" xmlns:w16sdtfl="http://schemas.microsoft.com/office/word/2024/wordml/sdtformatlock" xmlns:w16se="http://schemas.microsoft.com/office/word/2015/wordml/symex" xmlns:wpg="http://schemas.microsoft.com/office/word/2010/wordprocessingGroup" xmlns:wpi="http://schemas.microsoft.com/office/word/2010/wordprocessingInk" xmlns:wne="http://schemas.microsoft.com/office/word/2006/wordml" xmlns:wps="http://schemas.microsoft.com/office/word/2010/wordprocessingShape" mc:Ignorable="w14 w15 w16se w16cid w16 w16cex w16sdtdh w16sdtfl w16du wp14">
+  <w:p>
+    <w:pPr>
+      <w:pStyle w:val="Footer"/>
+    </w:pPr>
+  </w:p>
+</w:ftr>
+</file>
+
+<file path=word/footer3.xml><?xml version="1.0" encoding="utf-8"?>
+<w:ftr xmlns:wpc="http://schemas.microsoft.com/office/word/2010/wordprocessingCanvas" xmlns:cx="http://schemas.microsoft.com/office/drawing/2014/chartex" xmlns:cx1="http://schemas.microsoft.com/office/drawing/2015/9/8/chartex" xmlns:cx2="http://schemas.microsoft.com/office/drawing/2015/10/21/chartex" xmlns:cx3="http://schemas.microsoft.com/office/drawing/2016/5/9/chartex" xmlns:cx4="http://schemas.microsoft.com/office/drawing/2016/5/10/chartex" xmlns:cx5="http://schemas.microsoft.com/office/drawing/2016/5/11/chartex" xmlns:cx6="http://schemas.microsoft.com/office/drawing/2016/5/12/chartex" xmlns:cx7="http://schemas.microsoft.com/office/drawing/2016/5/13/chartex" xmlns:cx8="http://schemas.microsoft.com/office/drawing/2016/5/14/chartex" xmlns:mc="http://schemas.openxmlformats.org/markup-compatibility/2006" xmlns:aink="http://schemas.microsoft.com/office/drawing/2016/ink" xmlns:am3d="http://schemas.microsoft.com/office/drawing/2017/model3d" xmlns:o="urn:schemas-microsoft-com:office:office" xmlns:oel="http://schemas.microsoft.com/office/2019/extlst" xmlns:r="http://schemas.openxmlformats.org/officeDocument/2006/relationships" xmlns:m="http://schemas.openxmlformats.org/officeDocument/2006/math" xmlns:v="urn:schemas-microsoft-com:vml" xmlns:wp14="http://schemas.microsoft.com/office/word/2010/wordprocessingDrawing" xmlns:wp="http://schemas.openxmlformats.org/drawingml/2006/wordprocessingDrawing" xmlns:w10="urn:schemas-microsoft-com:office:word" xmlns:w="http://schemas.openxmlformats.org/wordprocessingml/2006/main" xmlns:w14="http://schemas.microsoft.com/office/word/2010/wordml" xmlns:w15="http://schemas.microsoft.com/office/word/2012/wordml" xmlns:w16cex="http://schemas.microsoft.com/office/word/2018/wordml/cex" xmlns:w16cid="http://schemas.microsoft.com/office/word/2016/wordml/cid" xmlns:w16="http://schemas.microsoft.com/office/word/2018/wordml" xmlns:w16du="http://schemas.microsoft.com/office/word/2023/wordml/word16du" xmlns:w16sdtdh="http://schemas.microsoft.com/office/word/2020/wordml/sdtdatahash" xmlns:w16sdtfl="http://schemas.microsoft.com/office/word/2024/wordml/sdtformatlock" xmlns:w16se="http://schemas.microsoft.com/office/word/2015/wordml/symex" xmlns:wpg="http://schemas.microsoft.com/office/word/2010/wordprocessingGroup" xmlns:wpi="http://schemas.microsoft.com/office/word/2010/wordprocessingInk" xmlns:wne="http://schemas.microsoft.com/office/word/2006/wordml" xmlns:wps="http://schemas.microsoft.com/office/word/2010/wordprocessingShape" mc:Ignorable="w14 w15 w16se w16cid w16 w16cex w16sdtdh w16sdtfl w16du wp14">
+  <w:p>
+    <w:pPr>
+      <w:pStyle w:val="Footer"/>
+    </w:pPr>
+  </w:p>
+</w:ftr>
+</file>
+
+<file path=word/footnotes.xml><?xml version="1.0" encoding="utf-8"?>
+<w:footnotes xmlns:wpc="http://schemas.microsoft.com/office/word/2010/wordprocessingCanvas" xmlns:cx="http://schemas.microsoft.com/office/drawing/2014/chartex" xmlns:cx1="http://schemas.microsoft.com/office/drawing/2015/9/8/chartex" xmlns:cx2="http://schemas.microsoft.com/office/drawing/2015/10/21/chartex" xmlns:cx3="http://schemas.microsoft.com/office/drawing/2016/5/9/chartex" xmlns:cx4="http://schemas.microsoft.com/office/drawing/2016/5/10/chartex" xmlns:cx5="http://schemas.microsoft.com/office/drawing/2016/5/11/chartex" xmlns:cx6="http://schemas.microsoft.com/office/drawing/2016/5/12/chartex" xmlns:cx7="http://schemas.microsoft.com/office/drawing/2016/5/13/chartex" xmlns:cx8="http://schemas.microsoft.com/office/drawing/2016/5/14/chartex" xmlns:mc="http://schemas.openxmlformats.org/markup-compatibility/2006" xmlns:aink="http://schemas.microsoft.com/office/drawing/2016/ink" xmlns:am3d="http://schemas.microsoft.com/office/drawing/2017/model3d" xmlns:o="urn:schemas-microsoft-com:office:office" xmlns:oel="http://schemas.microsoft.com/office/2019/extlst" xmlns:r="http://schemas.openxmlformats.org/officeDocument/2006/relationships" xmlns:m="http://schemas.openxmlformats.org/officeDocument/2006/math" xmlns:v="urn:schemas-microsoft-com:vml" xmlns:wp14="http://schemas.microsoft.com/office/word/2010/wordprocessingDrawing" xmlns:wp="http://schemas.openxmlformats.org/drawingml/2006/wordprocessingDrawing" xmlns:w10="urn:schemas-microsoft-com:office:word" xmlns:w="http://schemas.openxmlformats.org/wordprocessingml/2006/main" xmlns:w14="http://schemas.microsoft.com/office/word/2010/wordml" xmlns:w15="http://schemas.microsoft.com/office/word/2012/wordml" xmlns:w16cex="http://schemas.microsoft.com/office/word/2018/wordml/cex" xmlns:w16cid="http://schemas.microsoft.com/office/word/2016/wordml/cid" xmlns:w16="http://schemas.microsoft.com/office/word/2018/wordml" xmlns:w16du="http://schemas.microsoft.com/office/word/2023/wordml/word16du" xmlns:w16sdtdh="http://schemas.microsoft.com/office/word/2020/wordml/sdtdatahash" xmlns:w16sdtfl="http://schemas.microsoft.com/office/word/2024/wordml/sdtformatlock" xmlns:w16se="http://schemas.microsoft.com/office/word/2015/wordml/symex" xmlns:wpg="http://schemas.microsoft.com/office/word/2010/wordprocessingGroup" xmlns:wpi="http://schemas.microsoft.com/office/word/2010/wordprocessingInk" xmlns:wne="http://schemas.microsoft.com/office/word/2006/wordml" xmlns:wps="http://schemas.microsoft.com/office/word/2010/wordprocessingShape" mc:Ignorable="w14 w15 w16se w16cid w16 w16cex w16sdtdh w16sdtfl w16du wp14">
+  <w:footnote w:type="separator" w:id="-1">
+    <w:p>
+      <w:pPr>
+        <w:spacing w:after="0" w:line="240" w:lineRule="auto"/>
+      </w:pPr>
+      <w:r>
+        <w:separator/>
+      </w:r>
+    </w:p>
+  </w:footnote>
+  <w:footnote w:type="continuationSeparator" w:id="0">
+    <w:p>
+      <w:pPr>
+        <w:spacing w:after="0" w:line="240" w:lineRule="auto"/>
+      </w:pPr>
+      <w:r>
+        <w:continuationSeparator/>
+      </w:r>
+    </w:p>
+  </w:footnote>
+</w:footnotes>
+</file>
+
+<file path=word/header1.xml><?xml version="1.0" encoding="utf-8"?>
+<w:hdr xmlns:wpc="http://schemas.microsoft.com/office/word/2010/wordprocessingCanvas" xmlns:cx="http://schemas.microsoft.com/office/drawing/2014/chartex" xmlns:cx1="http://schemas.microsoft.com/office/drawing/2015/9/8/chartex" xmlns:cx2="http://schemas.microsoft.com/office/drawing/2015/10/21/chartex" xmlns:cx3="http://schemas.microsoft.com/office/drawing/2016/5/9/chartex" xmlns:cx4="http://schemas.microsoft.com/office/drawing/2016/5/10/chartex" xmlns:cx5="http://schemas.microsoft.com/office/drawing/2016/5/11/chartex" xmlns:cx6="http://schemas.microsoft.com/office/drawing/2016/5/12/chartex" xmlns:cx7="http://schemas.microsoft.com/office/drawing/2016/5/13/chartex" xmlns:cx8="http://schemas.microsoft.com/office/drawing/2016/5/14/chartex" xmlns:mc="http://schemas.openxmlformats.org/markup-compatibility/2006" xmlns:aink="http://schemas.microsoft.com/office/drawing/2016/ink" xmlns:am3d="http://schemas.microsoft.com/office/drawing/2017/model3d" xmlns:o="urn:schemas-microsoft-com:office:office" xmlns:oel="http://schemas.microsoft.com/office/2019/extlst" xmlns:r="http://schemas.openxmlformats.org/officeDocument/2006/relationships" xmlns:m="http://schemas.openxmlformats.org/officeDocument/2006/math" xmlns:v="urn:schemas-microsoft-com:vml" xmlns:wp14="http://schemas.microsoft.com/office/word/2010/wordprocessingDrawing" xmlns:wp="http://schemas.openxmlformats.org/drawingml/2006/wordprocessingDrawing" xmlns:w10="urn:schemas-microsoft-com:office:word" xmlns:w="http://schemas.openxmlformats.org/wordprocessingml/2006/main" xmlns:w14="http://schemas.microsoft.com/office/word/2010/wordml" xmlns:w15="http://schemas.microsoft.com/office/word/2012/wordml" xmlns:w16cex="http://schemas.microsoft.com/office/word/2018/wordml/cex" xmlns:w16cid="http://schemas.microsoft.com/office/word/2016/wordml/cid" xmlns:w16="http://schemas.microsoft.com/office/word/2018/wordml" xmlns:w16du="http://schemas.microsoft.com/office/word/2023/wordml/word16du" xmlns:w16sdtdh="http://schemas.microsoft.com/office/word/2020/wordml/sdtdatahash" xmlns:w16sdtfl="http://schemas.microsoft.com/office/word/2024/wordml/sdtformatlock" xmlns:w16se="http://schemas.microsoft.com/office/word/2015/wordml/symex" xmlns:wpg="http://schemas.microsoft.com/office/word/2010/wordprocessingGroup" xmlns:wpi="http://schemas.microsoft.com/office/word/2010/wordprocessingInk" xmlns:wne="http://schemas.microsoft.com/office/word/2006/wordml" xmlns:wps="http://schemas.microsoft.com/office/word/2010/wordprocessingShape" mc:Ignorable="w14 w15 w16se w16cid w16 w16cex w16sdtdh w16sdtfl w16du wp14">
+  <w:p>
+    <w:pPr>
+      <w:pStyle w:val="Header"/>
+    </w:pPr>
+  </w:p>
+</w:hdr>
+</file>
+
+<file path=word/header2.xml><?xml version="1.0" encoding="utf-8"?>
+<w:hdr xmlns:wpc="http://schemas.microsoft.com/office/word/2010/wordprocessingCanvas" xmlns:cx="http://schemas.microsoft.com/office/drawing/2014/chartex" xmlns:cx1="http://schemas.microsoft.com/office/drawing/2015/9/8/chartex" xmlns:cx2="http://schemas.microsoft.com/office/drawing/2015/10/21/chartex" xmlns:cx3="http://schemas.microsoft.com/office/drawing/2016/5/9/chartex" xmlns:cx4="http://schemas.microsoft.com/office/drawing/2016/5/10/chartex" xmlns:cx5="http://schemas.microsoft.com/office/drawing/2016/5/11/chartex" xmlns:cx6="http://schemas.microsoft.com/office/drawing/2016/5/12/chartex" xmlns:cx7="http://schemas.microsoft.com/office/drawing/2016/5/13/chartex" xmlns:cx8="http://schemas.microsoft.com/office/drawing/2016/5/14/chartex" xmlns:mc="http://schemas.openxmlformats.org/markup-compatibility/2006" xmlns:aink="http://schemas.microsoft.com/office/drawing/2016/ink" xmlns:am3d="http://schemas.microsoft.com/office/drawing/2017/model3d" xmlns:o="urn:schemas-microsoft-com:office:office" xmlns:oel="http://schemas.microsoft.com/office/2019/extlst" xmlns:r="http://schemas.openxmlformats.org/officeDocument/2006/relationships" xmlns:m="http://schemas.openxmlformats.org/officeDocument/2006/math" xmlns:v="urn:schemas-microsoft-com:vml" xmlns:wp14="http://schemas.microsoft.com/office/word/2010/wordprocessingDrawing" xmlns:wp="http://schemas.openxmlformats.org/drawingml/2006/wordprocessingDrawing" xmlns:w10="urn:schemas-microsoft-com:office:word" xmlns:w="http://schemas.openxmlformats.org/wordprocessingml/2006/main" xmlns:w14="http://schemas.microsoft.com/office/word/2010/wordml" xmlns:w15="http://schemas.microsoft.com/office/word/2012/wordml" xmlns:w16cex="http://schemas.microsoft.com/office/word/2018/wordml/cex" xmlns:w16cid="http://schemas.microsoft.com/office/word/2016/wordml/cid" xmlns:w16="http://schemas.microsoft.com/office/word/2018/wordml" xmlns:w16du="http://schemas.microsoft.com/office/word/2023/wordml/word16du" xmlns:w16sdtdh="http://schemas.microsoft.com/office/word/2020/wordml/sdtdatahash" xmlns:w16sdtfl="http://schemas.microsoft.com/office/word/2024/wordml/sdtformatlock" xmlns:w16se="http://schemas.microsoft.com/office/word/2015/wordml/symex" xmlns:wpg="http://schemas.microsoft.com/office/word/2010/wordprocessingGroup" xmlns:wpi="http://schemas.microsoft.com/office/word/2010/wordprocessingInk" xmlns:wne="http://schemas.microsoft.com/office/word/2006/wordml" xmlns:wps="http://schemas.microsoft.com/office/word/2010/wordprocessingShape" mc:Ignorable="w14 w15 w16se w16cid w16 w16cex w16sdtdh w16sdtfl w16du wp14">
+  <w:p>
+    <w:pPr>
+      <w:pStyle w:val="Header"/>
+    </w:pPr>
+  </w:p>
+</w:hdr>
+</file>
+
+<file path=word/header3.xml><?xml version="1.0" encoding="utf-8"?>
+<w:hdr xmlns:wpc="http://schemas.microsoft.com/office/word/2010/wordprocessingCanvas" xmlns:cx="http://schemas.microsoft.com/office/drawing/2014/chartex" xmlns:cx1="http://schemas.microsoft.com/office/drawing/2015/9/8/chartex" xmlns:cx2="http://schemas.microsoft.com/office/drawing/2015/10/21/chartex" xmlns:cx3="http://schemas.microsoft.com/office/drawing/2016/5/9/chartex" xmlns:cx4="http://schemas.microsoft.com/office/drawing/2016/5/10/chartex" xmlns:cx5="http://schemas.microsoft.com/office/drawing/2016/5/11/chartex" xmlns:cx6="http://schemas.microsoft.com/office/drawing/2016/5/12/chartex" xmlns:cx7="http://schemas.microsoft.com/office/drawing/2016/5/13/chartex" xmlns:cx8="http://schemas.microsoft.com/office/drawing/2016/5/14/chartex" xmlns:mc="http://schemas.openxmlformats.org/markup-compatibility/2006" xmlns:aink="http://schemas.microsoft.com/office/drawing/2016/ink" xmlns:am3d="http://schemas.microsoft.com/office/drawing/2017/model3d" xmlns:o="urn:schemas-microsoft-com:office:office" xmlns:oel="http://schemas.microsoft.com/office/2019/extlst" xmlns:r="http://schemas.openxmlformats.org/officeDocument/2006/relationships" xmlns:m="http://schemas.openxmlformats.org/officeDocument/2006/math" xmlns:v="urn:schemas-microsoft-com:vml" xmlns:wp14="http://schemas.microsoft.com/office/word/2010/wordprocessingDrawing" xmlns:wp="http://schemas.openxmlformats.org/drawingml/2006/wordprocessingDrawing" xmlns:w10="urn:schemas-microsoft-com:office:word" xmlns:w="http://schemas.openxmlformats.org/wordprocessingml/2006/main" xmlns:w14="http://schemas.microsoft.com/office/word/2010/wordml" xmlns:w15="http://schemas.microsoft.com/office/word/2012/wordml" xmlns:w16cex="http://schemas.microsoft.com/office/word/2018/wordml/cex" xmlns:w16cid="http://schemas.microsoft.com/office/word/2016/wordml/cid" xmlns:w16="http://schemas.microsoft.com/office/word/2018/wordml" xmlns:w16du="http://schemas.microsoft.com/office/word/2023/wordml/word16du" xmlns:w16sdtdh="http://schemas.microsoft.com/office/word/2020/wordml/sdtdatahash" xmlns:w16sdtfl="http://schemas.microsoft.com/office/word/2024/wordml/sdtformatlock" xmlns:w16se="http://schemas.microsoft.com/office/word/2015/wordml/symex" xmlns:wpg="http://schemas.microsoft.com/office/word/2010/wordprocessingGroup" xmlns:wpi="http://schemas.microsoft.com/office/word/2010/wordprocessingInk" xmlns:wne="http://schemas.microsoft.com/office/word/2006/wordml" xmlns:wps="http://schemas.microsoft.com/office/word/2010/wordprocessingShape" mc:Ignorable="w14 w15 w16se w16cid w16 w16cex w16sdtdh w16sdtfl w16du wp14">
+  <w:p>
+    <w:pPr>
+      <w:pStyle w:val="Header"/>
+    </w:pPr>
+  </w:p>
+</w:hdr>
 </file>
 
 <file path=word/numbering.xml><?xml version="1.0" encoding="utf-8"?>
@@ -1370,6 +1678,7 @@
   <w:style w:type="character" w:default="1" w:styleId="DefaultParagraphFont">
     <w:name w:val="Default Paragraph Font"/>
     <w:uiPriority w:val="1"/>
+    <w:semiHidden/>
     <w:unhideWhenUsed/>
   </w:style>
   <w:style w:type="table" w:default="1" w:styleId="TableNormal">
@@ -1682,6 +1991,50 @@
       <w:color w:val="0F4761" w:themeColor="accent1" w:themeShade="BF"/>
       <w:spacing w:val="5"/>
     </w:rPr>
+  </w:style>
+  <w:style w:type="paragraph" w:styleId="Header">
+    <w:name w:val="header"/>
+    <w:basedOn w:val="Normal"/>
+    <w:link w:val="HeaderChar"/>
+    <w:uiPriority w:val="99"/>
+    <w:unhideWhenUsed/>
+    <w:rsid w:val="00814000"/>
+    <w:pPr>
+      <w:tabs>
+        <w:tab w:val="center" w:pos="4513"/>
+        <w:tab w:val="right" w:pos="9026"/>
+      </w:tabs>
+      <w:spacing w:after="0" w:line="240" w:lineRule="auto"/>
+    </w:pPr>
+  </w:style>
+  <w:style w:type="character" w:customStyle="1" w:styleId="HeaderChar">
+    <w:name w:val="Header Char"/>
+    <w:basedOn w:val="DefaultParagraphFont"/>
+    <w:link w:val="Header"/>
+    <w:uiPriority w:val="99"/>
+    <w:rsid w:val="00814000"/>
+  </w:style>
+  <w:style w:type="paragraph" w:styleId="Footer">
+    <w:name w:val="footer"/>
+    <w:basedOn w:val="Normal"/>
+    <w:link w:val="FooterChar"/>
+    <w:uiPriority w:val="99"/>
+    <w:unhideWhenUsed/>
+    <w:rsid w:val="00814000"/>
+    <w:pPr>
+      <w:tabs>
+        <w:tab w:val="center" w:pos="4513"/>
+        <w:tab w:val="right" w:pos="9026"/>
+      </w:tabs>
+      <w:spacing w:after="0" w:line="240" w:lineRule="auto"/>
+    </w:pPr>
+  </w:style>
+  <w:style w:type="character" w:customStyle="1" w:styleId="FooterChar">
+    <w:name w:val="Footer Char"/>
+    <w:basedOn w:val="DefaultParagraphFont"/>
+    <w:link w:val="Footer"/>
+    <w:uiPriority w:val="99"/>
+    <w:rsid w:val="00814000"/>
   </w:style>
 </w:styles>
 </file>
@@ -1999,4 +2352,16 @@
     </a:ext>
   </a:extLst>
 </a:theme>
+</file>
+
+<file path=customXml/item1.xml><?xml version="1.0" encoding="utf-8"?>
+<b:Sources xmlns:b="http://schemas.openxmlformats.org/officeDocument/2006/bibliography" xmlns="http://schemas.openxmlformats.org/officeDocument/2006/bibliography" SelectedStyle="\APASixthEditionOfficeOnline.xsl" StyleName="APA" Version="6"/>
+</file>
+
+<file path=customXml/itemProps1.xml><?xml version="1.0" encoding="utf-8"?>
+<ds:datastoreItem xmlns:ds="http://schemas.openxmlformats.org/officeDocument/2006/customXml" ds:itemID="{5FB7304B-C8A9-4018-955D-46BE0D6DB8F5}">
+  <ds:schemaRefs>
+    <ds:schemaRef ds:uri="http://schemas.openxmlformats.org/officeDocument/2006/bibliography"/>
+  </ds:schemaRefs>
+</ds:datastoreItem>
 </file>
</xml_diff>